<commit_message>
Corregir dos ecuaciones editables del manual técnico
</commit_message>
<xml_diff>
--- a/docs/docx/Manual_tecnico_BikeEnergyLab_1.0.0.docx
+++ b/docs/docx/Manual_tecnico_BikeEnergyLab_1.0.0.docx
@@ -562,7 +562,7 @@
       <w:r>
         <w:fldChar w:fldCharType="separate"/>
       </w:r>
-      <w:hyperlink w:anchor="_Toc242347100" w:history="1">
+      <w:hyperlink w:anchor="_Toc242349843" w:history="1">
         <w:r>
           <w:rPr>
             <w:rStyle w:val="Hyperlink"/>
@@ -589,7 +589,7 @@
             <w:noProof/>
             <w:webHidden/>
           </w:rPr>
-          <w:instrText xml:space="preserve"> PAGEREF _Toc242347100 \h </w:instrText>
+          <w:instrText xml:space="preserve"> PAGEREF _Toc242349843 \h </w:instrText>
         </w:r>
         <w:r>
           <w:rPr>
@@ -635,7 +635,7 @@
           <w:lang w:val="es-CO" w:eastAsia="es-CO"/>
         </w:rPr>
       </w:pPr>
-      <w:hyperlink w:anchor="_Toc242347101" w:history="1">
+      <w:hyperlink w:anchor="_Toc242349844" w:history="1">
         <w:r>
           <w:rPr>
             <w:rStyle w:val="Hyperlink"/>
@@ -662,7 +662,7 @@
             <w:noProof/>
             <w:webHidden/>
           </w:rPr>
-          <w:instrText xml:space="preserve"> PAGEREF _Toc242347101 \h </w:instrText>
+          <w:instrText xml:space="preserve"> PAGEREF _Toc242349844 \h </w:instrText>
         </w:r>
         <w:r>
           <w:rPr>
@@ -708,7 +708,7 @@
           <w:lang w:val="es-CO" w:eastAsia="es-CO"/>
         </w:rPr>
       </w:pPr>
-      <w:hyperlink w:anchor="_Toc242347102" w:history="1">
+      <w:hyperlink w:anchor="_Toc242349845" w:history="1">
         <w:r>
           <w:rPr>
             <w:rStyle w:val="Hyperlink"/>
@@ -735,7 +735,7 @@
             <w:noProof/>
             <w:webHidden/>
           </w:rPr>
-          <w:instrText xml:space="preserve"> PAGEREF _Toc242347102 \h </w:instrText>
+          <w:instrText xml:space="preserve"> PAGEREF _Toc242349845 \h </w:instrText>
         </w:r>
         <w:r>
           <w:rPr>
@@ -781,7 +781,7 @@
           <w:lang w:val="es-CO" w:eastAsia="es-CO"/>
         </w:rPr>
       </w:pPr>
-      <w:hyperlink w:anchor="_Toc242347103" w:history="1">
+      <w:hyperlink w:anchor="_Toc242349846" w:history="1">
         <w:r>
           <w:rPr>
             <w:rStyle w:val="Hyperlink"/>
@@ -808,7 +808,7 @@
             <w:noProof/>
             <w:webHidden/>
           </w:rPr>
-          <w:instrText xml:space="preserve"> PAGEREF _Toc242347103 \h </w:instrText>
+          <w:instrText xml:space="preserve"> PAGEREF _Toc242349846 \h </w:instrText>
         </w:r>
         <w:r>
           <w:rPr>
@@ -854,7 +854,7 @@
           <w:lang w:val="es-CO" w:eastAsia="es-CO"/>
         </w:rPr>
       </w:pPr>
-      <w:hyperlink w:anchor="_Toc242347104" w:history="1">
+      <w:hyperlink w:anchor="_Toc242349847" w:history="1">
         <w:r>
           <w:rPr>
             <w:rStyle w:val="Hyperlink"/>
@@ -881,7 +881,7 @@
             <w:noProof/>
             <w:webHidden/>
           </w:rPr>
-          <w:instrText xml:space="preserve"> PAGEREF _Toc242347104 \h </w:instrText>
+          <w:instrText xml:space="preserve"> PAGEREF _Toc242349847 \h </w:instrText>
         </w:r>
         <w:r>
           <w:rPr>
@@ -927,7 +927,7 @@
           <w:lang w:val="es-CO" w:eastAsia="es-CO"/>
         </w:rPr>
       </w:pPr>
-      <w:hyperlink w:anchor="_Toc242347105" w:history="1">
+      <w:hyperlink w:anchor="_Toc242349848" w:history="1">
         <w:r>
           <w:rPr>
             <w:rStyle w:val="Hyperlink"/>
@@ -954,7 +954,7 @@
             <w:noProof/>
             <w:webHidden/>
           </w:rPr>
-          <w:instrText xml:space="preserve"> PAGEREF _Toc242347105 \h </w:instrText>
+          <w:instrText xml:space="preserve"> PAGEREF _Toc242349848 \h </w:instrText>
         </w:r>
         <w:r>
           <w:rPr>
@@ -1000,7 +1000,7 @@
           <w:lang w:val="es-CO" w:eastAsia="es-CO"/>
         </w:rPr>
       </w:pPr>
-      <w:hyperlink w:anchor="_Toc242347106" w:history="1">
+      <w:hyperlink w:anchor="_Toc242349849" w:history="1">
         <w:r>
           <w:rPr>
             <w:rStyle w:val="Hyperlink"/>
@@ -1027,7 +1027,7 @@
             <w:noProof/>
             <w:webHidden/>
           </w:rPr>
-          <w:instrText xml:space="preserve"> PAGEREF _Toc242347106 \h </w:instrText>
+          <w:instrText xml:space="preserve"> PAGEREF _Toc242349849 \h </w:instrText>
         </w:r>
         <w:r>
           <w:rPr>
@@ -1073,7 +1073,7 @@
           <w:lang w:val="es-CO" w:eastAsia="es-CO"/>
         </w:rPr>
       </w:pPr>
-      <w:hyperlink w:anchor="_Toc242347107" w:history="1">
+      <w:hyperlink w:anchor="_Toc242349850" w:history="1">
         <w:r>
           <w:rPr>
             <w:rStyle w:val="Hyperlink"/>
@@ -1100,7 +1100,7 @@
             <w:noProof/>
             <w:webHidden/>
           </w:rPr>
-          <w:instrText xml:space="preserve"> PAGEREF _Toc242347107 \h </w:instrText>
+          <w:instrText xml:space="preserve"> PAGEREF _Toc242349850 \h </w:instrText>
         </w:r>
         <w:r>
           <w:rPr>
@@ -1146,7 +1146,7 @@
           <w:lang w:val="es-CO" w:eastAsia="es-CO"/>
         </w:rPr>
       </w:pPr>
-      <w:hyperlink w:anchor="_Toc242347108" w:history="1">
+      <w:hyperlink w:anchor="_Toc242349851" w:history="1">
         <w:r>
           <w:rPr>
             <w:rStyle w:val="Hyperlink"/>
@@ -1173,7 +1173,7 @@
             <w:noProof/>
             <w:webHidden/>
           </w:rPr>
-          <w:instrText xml:space="preserve"> PAGEREF _Toc242347108 \h </w:instrText>
+          <w:instrText xml:space="preserve"> PAGEREF _Toc242349851 \h </w:instrText>
         </w:r>
         <w:r>
           <w:rPr>
@@ -1219,7 +1219,7 @@
           <w:lang w:val="es-CO" w:eastAsia="es-CO"/>
         </w:rPr>
       </w:pPr>
-      <w:hyperlink w:anchor="_Toc242347109" w:history="1">
+      <w:hyperlink w:anchor="_Toc242349852" w:history="1">
         <w:r>
           <w:rPr>
             <w:rStyle w:val="Hyperlink"/>
@@ -1246,7 +1246,7 @@
             <w:noProof/>
             <w:webHidden/>
           </w:rPr>
-          <w:instrText xml:space="preserve"> PAGEREF _Toc242347109 \h </w:instrText>
+          <w:instrText xml:space="preserve"> PAGEREF _Toc242349852 \h </w:instrText>
         </w:r>
         <w:r>
           <w:rPr>
@@ -1292,7 +1292,7 @@
           <w:lang w:val="es-CO" w:eastAsia="es-CO"/>
         </w:rPr>
       </w:pPr>
-      <w:hyperlink w:anchor="_Toc242347110" w:history="1">
+      <w:hyperlink w:anchor="_Toc242349853" w:history="1">
         <w:r>
           <w:rPr>
             <w:rStyle w:val="Hyperlink"/>
@@ -1319,7 +1319,7 @@
             <w:noProof/>
             <w:webHidden/>
           </w:rPr>
-          <w:instrText xml:space="preserve"> PAGEREF _Toc242347110 \h </w:instrText>
+          <w:instrText xml:space="preserve"> PAGEREF _Toc242349853 \h </w:instrText>
         </w:r>
         <w:r>
           <w:rPr>
@@ -1365,7 +1365,7 @@
           <w:lang w:val="es-CO" w:eastAsia="es-CO"/>
         </w:rPr>
       </w:pPr>
-      <w:hyperlink w:anchor="_Toc242347111" w:history="1">
+      <w:hyperlink w:anchor="_Toc242349854" w:history="1">
         <w:r>
           <w:rPr>
             <w:rStyle w:val="Hyperlink"/>
@@ -1392,7 +1392,7 @@
             <w:noProof/>
             <w:webHidden/>
           </w:rPr>
-          <w:instrText xml:space="preserve"> PAGEREF _Toc242347111 \h </w:instrText>
+          <w:instrText xml:space="preserve"> PAGEREF _Toc242349854 \h </w:instrText>
         </w:r>
         <w:r>
           <w:rPr>
@@ -1438,7 +1438,7 @@
           <w:lang w:val="es-CO" w:eastAsia="es-CO"/>
         </w:rPr>
       </w:pPr>
-      <w:hyperlink w:anchor="_Toc242347112" w:history="1">
+      <w:hyperlink w:anchor="_Toc242349855" w:history="1">
         <w:r>
           <w:rPr>
             <w:rStyle w:val="Hyperlink"/>
@@ -1465,7 +1465,7 @@
             <w:noProof/>
             <w:webHidden/>
           </w:rPr>
-          <w:instrText xml:space="preserve"> PAGEREF _Toc242347112 \h </w:instrText>
+          <w:instrText xml:space="preserve"> PAGEREF _Toc242349855 \h </w:instrText>
         </w:r>
         <w:r>
           <w:rPr>
@@ -1511,7 +1511,7 @@
           <w:lang w:val="es-CO" w:eastAsia="es-CO"/>
         </w:rPr>
       </w:pPr>
-      <w:hyperlink w:anchor="_Toc242347113" w:history="1">
+      <w:hyperlink w:anchor="_Toc242349856" w:history="1">
         <w:r>
           <w:rPr>
             <w:rStyle w:val="Hyperlink"/>
@@ -1538,7 +1538,7 @@
             <w:noProof/>
             <w:webHidden/>
           </w:rPr>
-          <w:instrText xml:space="preserve"> PAGEREF _Toc242347113 \h </w:instrText>
+          <w:instrText xml:space="preserve"> PAGEREF _Toc242349856 \h </w:instrText>
         </w:r>
         <w:r>
           <w:rPr>
@@ -1584,7 +1584,7 @@
           <w:lang w:val="es-CO" w:eastAsia="es-CO"/>
         </w:rPr>
       </w:pPr>
-      <w:hyperlink w:anchor="_Toc242347114" w:history="1">
+      <w:hyperlink w:anchor="_Toc242349857" w:history="1">
         <w:r>
           <w:rPr>
             <w:rStyle w:val="Hyperlink"/>
@@ -1611,7 +1611,7 @@
             <w:noProof/>
             <w:webHidden/>
           </w:rPr>
-          <w:instrText xml:space="preserve"> PAGEREF _Toc242347114 \h </w:instrText>
+          <w:instrText xml:space="preserve"> PAGEREF _Toc242349857 \h </w:instrText>
         </w:r>
         <w:r>
           <w:rPr>
@@ -1657,7 +1657,7 @@
           <w:lang w:val="es-CO" w:eastAsia="es-CO"/>
         </w:rPr>
       </w:pPr>
-      <w:hyperlink w:anchor="_Toc242347115" w:history="1">
+      <w:hyperlink w:anchor="_Toc242349858" w:history="1">
         <w:r>
           <w:rPr>
             <w:rStyle w:val="Hyperlink"/>
@@ -1684,7 +1684,7 @@
             <w:noProof/>
             <w:webHidden/>
           </w:rPr>
-          <w:instrText xml:space="preserve"> PAGEREF _Toc242347115 \h </w:instrText>
+          <w:instrText xml:space="preserve"> PAGEREF _Toc242349858 \h </w:instrText>
         </w:r>
         <w:r>
           <w:rPr>
@@ -1730,7 +1730,7 @@
           <w:lang w:val="es-CO" w:eastAsia="es-CO"/>
         </w:rPr>
       </w:pPr>
-      <w:hyperlink w:anchor="_Toc242347116" w:history="1">
+      <w:hyperlink w:anchor="_Toc242349859" w:history="1">
         <w:r>
           <w:rPr>
             <w:rStyle w:val="Hyperlink"/>
@@ -1757,7 +1757,7 @@
             <w:noProof/>
             <w:webHidden/>
           </w:rPr>
-          <w:instrText xml:space="preserve"> PAGEREF _Toc242347116 \h </w:instrText>
+          <w:instrText xml:space="preserve"> PAGEREF _Toc242349859 \h </w:instrText>
         </w:r>
         <w:r>
           <w:rPr>
@@ -1803,7 +1803,7 @@
           <w:lang w:val="es-CO" w:eastAsia="es-CO"/>
         </w:rPr>
       </w:pPr>
-      <w:hyperlink w:anchor="_Toc242347117" w:history="1">
+      <w:hyperlink w:anchor="_Toc242349860" w:history="1">
         <w:r>
           <w:rPr>
             <w:rStyle w:val="Hyperlink"/>
@@ -1830,7 +1830,7 @@
             <w:noProof/>
             <w:webHidden/>
           </w:rPr>
-          <w:instrText xml:space="preserve"> PAGEREF _Toc242347117 \h </w:instrText>
+          <w:instrText xml:space="preserve"> PAGEREF _Toc242349860 \h </w:instrText>
         </w:r>
         <w:r>
           <w:rPr>
@@ -1876,7 +1876,7 @@
           <w:lang w:val="es-CO" w:eastAsia="es-CO"/>
         </w:rPr>
       </w:pPr>
-      <w:hyperlink w:anchor="_Toc242347118" w:history="1">
+      <w:hyperlink w:anchor="_Toc242349861" w:history="1">
         <w:r>
           <w:rPr>
             <w:rStyle w:val="Hyperlink"/>
@@ -1903,7 +1903,7 @@
             <w:noProof/>
             <w:webHidden/>
           </w:rPr>
-          <w:instrText xml:space="preserve"> PAGEREF _Toc242347118 \h </w:instrText>
+          <w:instrText xml:space="preserve"> PAGEREF _Toc242349861 \h </w:instrText>
         </w:r>
         <w:r>
           <w:rPr>
@@ -1949,7 +1949,7 @@
           <w:lang w:val="es-CO" w:eastAsia="es-CO"/>
         </w:rPr>
       </w:pPr>
-      <w:hyperlink w:anchor="_Toc242347119" w:history="1">
+      <w:hyperlink w:anchor="_Toc242349862" w:history="1">
         <w:r>
           <w:rPr>
             <w:rStyle w:val="Hyperlink"/>
@@ -1976,7 +1976,7 @@
             <w:noProof/>
             <w:webHidden/>
           </w:rPr>
-          <w:instrText xml:space="preserve"> PAGEREF _Toc242347119 \h </w:instrText>
+          <w:instrText xml:space="preserve"> PAGEREF _Toc242349862 \h </w:instrText>
         </w:r>
         <w:r>
           <w:rPr>
@@ -2022,7 +2022,7 @@
           <w:lang w:val="es-CO" w:eastAsia="es-CO"/>
         </w:rPr>
       </w:pPr>
-      <w:hyperlink w:anchor="_Toc242347120" w:history="1">
+      <w:hyperlink w:anchor="_Toc242349863" w:history="1">
         <w:r>
           <w:rPr>
             <w:rStyle w:val="Hyperlink"/>
@@ -2049,7 +2049,7 @@
             <w:noProof/>
             <w:webHidden/>
           </w:rPr>
-          <w:instrText xml:space="preserve"> PAGEREF _Toc242347120 \h </w:instrText>
+          <w:instrText xml:space="preserve"> PAGEREF _Toc242349863 \h </w:instrText>
         </w:r>
         <w:r>
           <w:rPr>
@@ -2095,7 +2095,7 @@
           <w:lang w:val="es-CO" w:eastAsia="es-CO"/>
         </w:rPr>
       </w:pPr>
-      <w:hyperlink w:anchor="_Toc242347121" w:history="1">
+      <w:hyperlink w:anchor="_Toc242349864" w:history="1">
         <w:r>
           <w:rPr>
             <w:rStyle w:val="Hyperlink"/>
@@ -2122,7 +2122,7 @@
             <w:noProof/>
             <w:webHidden/>
           </w:rPr>
-          <w:instrText xml:space="preserve"> PAGEREF _Toc242347121 \h </w:instrText>
+          <w:instrText xml:space="preserve"> PAGEREF _Toc242349864 \h </w:instrText>
         </w:r>
         <w:r>
           <w:rPr>
@@ -2168,7 +2168,7 @@
           <w:lang w:val="es-CO" w:eastAsia="es-CO"/>
         </w:rPr>
       </w:pPr>
-      <w:hyperlink w:anchor="_Toc242347122" w:history="1">
+      <w:hyperlink w:anchor="_Toc242349865" w:history="1">
         <w:r>
           <w:rPr>
             <w:rStyle w:val="Hyperlink"/>
@@ -2195,7 +2195,7 @@
             <w:noProof/>
             <w:webHidden/>
           </w:rPr>
-          <w:instrText xml:space="preserve"> PAGEREF _Toc242347122 \h </w:instrText>
+          <w:instrText xml:space="preserve"> PAGEREF _Toc242349865 \h </w:instrText>
         </w:r>
         <w:r>
           <w:rPr>
@@ -2241,7 +2241,7 @@
           <w:lang w:val="es-CO" w:eastAsia="es-CO"/>
         </w:rPr>
       </w:pPr>
-      <w:hyperlink w:anchor="_Toc242347123" w:history="1">
+      <w:hyperlink w:anchor="_Toc242349866" w:history="1">
         <w:r>
           <w:rPr>
             <w:rStyle w:val="Hyperlink"/>
@@ -2268,7 +2268,7 @@
             <w:noProof/>
             <w:webHidden/>
           </w:rPr>
-          <w:instrText xml:space="preserve"> PAGEREF _Toc242347123 \h </w:instrText>
+          <w:instrText xml:space="preserve"> PAGEREF _Toc242349866 \h </w:instrText>
         </w:r>
         <w:r>
           <w:rPr>
@@ -2314,7 +2314,7 @@
           <w:lang w:val="es-CO" w:eastAsia="es-CO"/>
         </w:rPr>
       </w:pPr>
-      <w:hyperlink w:anchor="_Toc242347124" w:history="1">
+      <w:hyperlink w:anchor="_Toc242349867" w:history="1">
         <w:r>
           <w:rPr>
             <w:rStyle w:val="Hyperlink"/>
@@ -2341,7 +2341,7 @@
             <w:noProof/>
             <w:webHidden/>
           </w:rPr>
-          <w:instrText xml:space="preserve"> PAGEREF _Toc242347124 \h </w:instrText>
+          <w:instrText xml:space="preserve"> PAGEREF _Toc242349867 \h </w:instrText>
         </w:r>
         <w:r>
           <w:rPr>
@@ -2387,7 +2387,7 @@
           <w:lang w:val="es-CO" w:eastAsia="es-CO"/>
         </w:rPr>
       </w:pPr>
-      <w:hyperlink w:anchor="_Toc242347125" w:history="1">
+      <w:hyperlink w:anchor="_Toc242349868" w:history="1">
         <w:r>
           <w:rPr>
             <w:rStyle w:val="Hyperlink"/>
@@ -2414,7 +2414,7 @@
             <w:noProof/>
             <w:webHidden/>
           </w:rPr>
-          <w:instrText xml:space="preserve"> PAGEREF _Toc242347125 \h </w:instrText>
+          <w:instrText xml:space="preserve"> PAGEREF _Toc242349868 \h </w:instrText>
         </w:r>
         <w:r>
           <w:rPr>
@@ -2460,7 +2460,7 @@
           <w:lang w:val="es-CO" w:eastAsia="es-CO"/>
         </w:rPr>
       </w:pPr>
-      <w:hyperlink w:anchor="_Toc242347126" w:history="1">
+      <w:hyperlink w:anchor="_Toc242349869" w:history="1">
         <w:r>
           <w:rPr>
             <w:rStyle w:val="Hyperlink"/>
@@ -2487,7 +2487,7 @@
             <w:noProof/>
             <w:webHidden/>
           </w:rPr>
-          <w:instrText xml:space="preserve"> PAGEREF _Toc242347126 \h </w:instrText>
+          <w:instrText xml:space="preserve"> PAGEREF _Toc242349869 \h </w:instrText>
         </w:r>
         <w:r>
           <w:rPr>
@@ -2533,7 +2533,7 @@
           <w:lang w:val="es-CO" w:eastAsia="es-CO"/>
         </w:rPr>
       </w:pPr>
-      <w:hyperlink w:anchor="_Toc242347127" w:history="1">
+      <w:hyperlink w:anchor="_Toc242349870" w:history="1">
         <w:r>
           <w:rPr>
             <w:rStyle w:val="Hyperlink"/>
@@ -2560,7 +2560,7 @@
             <w:noProof/>
             <w:webHidden/>
           </w:rPr>
-          <w:instrText xml:space="preserve"> PAGEREF _Toc242347127 \h </w:instrText>
+          <w:instrText xml:space="preserve"> PAGEREF _Toc242349870 \h </w:instrText>
         </w:r>
         <w:r>
           <w:rPr>
@@ -2606,7 +2606,7 @@
           <w:lang w:val="es-CO" w:eastAsia="es-CO"/>
         </w:rPr>
       </w:pPr>
-      <w:hyperlink w:anchor="_Toc242347128" w:history="1">
+      <w:hyperlink w:anchor="_Toc242349871" w:history="1">
         <w:r>
           <w:rPr>
             <w:rStyle w:val="Hyperlink"/>
@@ -2633,7 +2633,7 @@
             <w:noProof/>
             <w:webHidden/>
           </w:rPr>
-          <w:instrText xml:space="preserve"> PAGEREF _Toc242347128 \h </w:instrText>
+          <w:instrText xml:space="preserve"> PAGEREF _Toc242349871 \h </w:instrText>
         </w:r>
         <w:r>
           <w:rPr>
@@ -2679,7 +2679,7 @@
           <w:lang w:val="es-CO" w:eastAsia="es-CO"/>
         </w:rPr>
       </w:pPr>
-      <w:hyperlink w:anchor="_Toc242347129" w:history="1">
+      <w:hyperlink w:anchor="_Toc242349872" w:history="1">
         <w:r>
           <w:rPr>
             <w:rStyle w:val="Hyperlink"/>
@@ -2706,7 +2706,7 @@
             <w:noProof/>
             <w:webHidden/>
           </w:rPr>
-          <w:instrText xml:space="preserve"> PAGEREF _Toc242347129 \h </w:instrText>
+          <w:instrText xml:space="preserve"> PAGEREF _Toc242349872 \h </w:instrText>
         </w:r>
         <w:r>
           <w:rPr>
@@ -2752,7 +2752,7 @@
           <w:lang w:val="es-CO" w:eastAsia="es-CO"/>
         </w:rPr>
       </w:pPr>
-      <w:hyperlink w:anchor="_Toc242347130" w:history="1">
+      <w:hyperlink w:anchor="_Toc242349873" w:history="1">
         <w:r>
           <w:rPr>
             <w:rStyle w:val="Hyperlink"/>
@@ -2779,7 +2779,7 @@
             <w:noProof/>
             <w:webHidden/>
           </w:rPr>
-          <w:instrText xml:space="preserve"> PAGEREF _Toc242347130 \h </w:instrText>
+          <w:instrText xml:space="preserve"> PAGEREF _Toc242349873 \h </w:instrText>
         </w:r>
         <w:r>
           <w:rPr>
@@ -2825,7 +2825,7 @@
           <w:lang w:val="es-CO" w:eastAsia="es-CO"/>
         </w:rPr>
       </w:pPr>
-      <w:hyperlink w:anchor="_Toc242347131" w:history="1">
+      <w:hyperlink w:anchor="_Toc242349874" w:history="1">
         <w:r>
           <w:rPr>
             <w:rStyle w:val="Hyperlink"/>
@@ -2852,7 +2852,7 @@
             <w:noProof/>
             <w:webHidden/>
           </w:rPr>
-          <w:instrText xml:space="preserve"> PAGEREF _Toc242347131 \h </w:instrText>
+          <w:instrText xml:space="preserve"> PAGEREF _Toc242349874 \h </w:instrText>
         </w:r>
         <w:r>
           <w:rPr>
@@ -2898,7 +2898,7 @@
           <w:lang w:val="es-CO" w:eastAsia="es-CO"/>
         </w:rPr>
       </w:pPr>
-      <w:hyperlink w:anchor="_Toc242347132" w:history="1">
+      <w:hyperlink w:anchor="_Toc242349875" w:history="1">
         <w:r>
           <w:rPr>
             <w:rStyle w:val="Hyperlink"/>
@@ -2925,7 +2925,7 @@
             <w:noProof/>
             <w:webHidden/>
           </w:rPr>
-          <w:instrText xml:space="preserve"> PAGEREF _Toc242347132 \h </w:instrText>
+          <w:instrText xml:space="preserve"> PAGEREF _Toc242349875 \h </w:instrText>
         </w:r>
         <w:r>
           <w:rPr>
@@ -2971,7 +2971,7 @@
           <w:lang w:val="es-CO" w:eastAsia="es-CO"/>
         </w:rPr>
       </w:pPr>
-      <w:hyperlink w:anchor="_Toc242347133" w:history="1">
+      <w:hyperlink w:anchor="_Toc242349876" w:history="1">
         <w:r>
           <w:rPr>
             <w:rStyle w:val="Hyperlink"/>
@@ -2998,7 +2998,7 @@
             <w:noProof/>
             <w:webHidden/>
           </w:rPr>
-          <w:instrText xml:space="preserve"> PAGEREF _Toc242347133 \h </w:instrText>
+          <w:instrText xml:space="preserve"> PAGEREF _Toc242349876 \h </w:instrText>
         </w:r>
         <w:r>
           <w:rPr>
@@ -3044,7 +3044,7 @@
           <w:lang w:val="es-CO" w:eastAsia="es-CO"/>
         </w:rPr>
       </w:pPr>
-      <w:hyperlink w:anchor="_Toc242347134" w:history="1">
+      <w:hyperlink w:anchor="_Toc242349877" w:history="1">
         <w:r>
           <w:rPr>
             <w:rStyle w:val="Hyperlink"/>
@@ -3071,7 +3071,7 @@
             <w:noProof/>
             <w:webHidden/>
           </w:rPr>
-          <w:instrText xml:space="preserve"> PAGEREF _Toc242347134 \h </w:instrText>
+          <w:instrText xml:space="preserve"> PAGEREF _Toc242349877 \h </w:instrText>
         </w:r>
         <w:r>
           <w:rPr>
@@ -3117,7 +3117,7 @@
           <w:lang w:val="es-CO" w:eastAsia="es-CO"/>
         </w:rPr>
       </w:pPr>
-      <w:hyperlink w:anchor="_Toc242347135" w:history="1">
+      <w:hyperlink w:anchor="_Toc242349878" w:history="1">
         <w:r>
           <w:rPr>
             <w:rStyle w:val="Hyperlink"/>
@@ -3144,7 +3144,7 @@
             <w:noProof/>
             <w:webHidden/>
           </w:rPr>
-          <w:instrText xml:space="preserve"> PAGEREF _Toc242347135 \h </w:instrText>
+          <w:instrText xml:space="preserve"> PAGEREF _Toc242349878 \h </w:instrText>
         </w:r>
         <w:r>
           <w:rPr>
@@ -3190,7 +3190,7 @@
           <w:lang w:val="es-CO" w:eastAsia="es-CO"/>
         </w:rPr>
       </w:pPr>
-      <w:hyperlink w:anchor="_Toc242347136" w:history="1">
+      <w:hyperlink w:anchor="_Toc242349879" w:history="1">
         <w:r>
           <w:rPr>
             <w:rStyle w:val="Hyperlink"/>
@@ -3217,7 +3217,7 @@
             <w:noProof/>
             <w:webHidden/>
           </w:rPr>
-          <w:instrText xml:space="preserve"> PAGEREF _Toc242347136 \h </w:instrText>
+          <w:instrText xml:space="preserve"> PAGEREF _Toc242349879 \h </w:instrText>
         </w:r>
         <w:r>
           <w:rPr>
@@ -3263,7 +3263,7 @@
           <w:lang w:val="es-CO" w:eastAsia="es-CO"/>
         </w:rPr>
       </w:pPr>
-      <w:hyperlink w:anchor="_Toc242347137" w:history="1">
+      <w:hyperlink w:anchor="_Toc242349880" w:history="1">
         <w:r>
           <w:rPr>
             <w:rStyle w:val="Hyperlink"/>
@@ -3290,7 +3290,7 @@
             <w:noProof/>
             <w:webHidden/>
           </w:rPr>
-          <w:instrText xml:space="preserve"> PAGEREF _Toc242347137 \h </w:instrText>
+          <w:instrText xml:space="preserve"> PAGEREF _Toc242349880 \h </w:instrText>
         </w:r>
         <w:r>
           <w:rPr>
@@ -3344,7 +3344,7 @@
       <w:pPr>
         <w:pStyle w:val="Heading1"/>
       </w:pPr>
-      <w:bookmarkStart w:id="0" w:name="_Toc242347100"/>
+      <w:bookmarkStart w:id="0" w:name="_Toc242349843"/>
       <w:r>
         <w:lastRenderedPageBreak/>
         <w:t>1. Introducción</w:t>
@@ -3355,7 +3355,7 @@
       <w:pPr>
         <w:pStyle w:val="Heading2"/>
       </w:pPr>
-      <w:bookmarkStart w:id="1" w:name="_Toc242347101"/>
+      <w:bookmarkStart w:id="1" w:name="_Toc242349844"/>
       <w:r>
         <w:t>1.1 Propósito del software</w:t>
       </w:r>
@@ -3370,7 +3370,7 @@
       <w:pPr>
         <w:pStyle w:val="Heading2"/>
       </w:pPr>
-      <w:bookmarkStart w:id="2" w:name="_Toc242347102"/>
+      <w:bookmarkStart w:id="2" w:name="_Toc242349845"/>
       <w:r>
         <w:t>1.2 Contexto y alcance</w:t>
       </w:r>
@@ -3385,7 +3385,7 @@
       <w:pPr>
         <w:pStyle w:val="Heading2"/>
       </w:pPr>
-      <w:bookmarkStart w:id="3" w:name="_Toc242347103"/>
+      <w:bookmarkStart w:id="3" w:name="_Toc242349846"/>
       <w:r>
         <w:t>1.3 Pregunta de investigación y alcance</w:t>
       </w:r>
@@ -3417,7 +3417,7 @@
       <w:pPr>
         <w:pStyle w:val="Heading1"/>
       </w:pPr>
-      <w:bookmarkStart w:id="4" w:name="_Toc242347104"/>
+      <w:bookmarkStart w:id="4" w:name="_Toc242349847"/>
       <w:r>
         <w:t>2. Arquitectura del sistema</w:t>
       </w:r>
@@ -3427,7 +3427,7 @@
       <w:pPr>
         <w:pStyle w:val="Heading2"/>
       </w:pPr>
-      <w:bookmarkStart w:id="5" w:name="_Toc242347105"/>
+      <w:bookmarkStart w:id="5" w:name="_Toc242349848"/>
       <w:r>
         <w:t>2.1 Arquitectura y responsabilidades</w:t>
       </w:r>
@@ -4323,7 +4323,7 @@
       <w:pPr>
         <w:pStyle w:val="Heading1"/>
       </w:pPr>
-      <w:bookmarkStart w:id="6" w:name="_Toc242347106"/>
+      <w:bookmarkStart w:id="6" w:name="_Toc242349849"/>
       <w:r>
         <w:t>3. Componentes del software</w:t>
       </w:r>
@@ -4333,7 +4333,7 @@
       <w:pPr>
         <w:pStyle w:val="Heading2"/>
       </w:pPr>
-      <w:bookmarkStart w:id="7" w:name="_Toc242347107"/>
+      <w:bookmarkStart w:id="7" w:name="_Toc242349850"/>
       <w:r>
         <w:t>3.1 Clases públicas y uso de la API</w:t>
       </w:r>
@@ -4513,7 +4513,7 @@
       <w:pPr>
         <w:pStyle w:val="Heading2"/>
       </w:pPr>
-      <w:bookmarkStart w:id="8" w:name="_Toc242347108"/>
+      <w:bookmarkStart w:id="8" w:name="_Toc242349851"/>
       <w:r>
         <w:t>3.2 Configuración y parámetros físicos</w:t>
       </w:r>
@@ -5039,7 +5039,7 @@
       <w:pPr>
         <w:pStyle w:val="Heading2"/>
       </w:pPr>
-      <w:bookmarkStart w:id="9" w:name="_Toc242347109"/>
+      <w:bookmarkStart w:id="9" w:name="_Toc242349852"/>
       <w:r>
         <w:t>3.3 Unidades y convenciones</w:t>
       </w:r>
@@ -5617,7 +5617,7 @@
       <w:pPr>
         <w:pStyle w:val="Heading1"/>
       </w:pPr>
-      <w:bookmarkStart w:id="10" w:name="_Toc242347110"/>
+      <w:bookmarkStart w:id="10" w:name="_Toc242349853"/>
       <w:r>
         <w:t>4. Adquisición y procesamiento de datos</w:t>
       </w:r>
@@ -5627,7 +5627,7 @@
       <w:pPr>
         <w:pStyle w:val="Heading2"/>
       </w:pPr>
-      <w:bookmarkStart w:id="11" w:name="_Toc242347111"/>
+      <w:bookmarkStart w:id="11" w:name="_Toc242349854"/>
       <w:r>
         <w:t>4.1 Rutas y telemetría</w:t>
       </w:r>
@@ -5670,7 +5670,7 @@
       <w:pPr>
         <w:pStyle w:val="Heading1"/>
       </w:pPr>
-      <w:bookmarkStart w:id="12" w:name="_Toc242347112"/>
+      <w:bookmarkStart w:id="12" w:name="_Toc242349855"/>
       <w:r>
         <w:t>5. Flujo de operación del sistema</w:t>
       </w:r>
@@ -5680,7 +5680,7 @@
       <w:pPr>
         <w:pStyle w:val="Heading2"/>
       </w:pPr>
-      <w:bookmarkStart w:id="13" w:name="_Toc242347113"/>
+      <w:bookmarkStart w:id="13" w:name="_Toc242349856"/>
       <w:r>
         <w:t>5.1 Interfaz gráfica y tareas en segundo plano</w:t>
       </w:r>
@@ -5710,7 +5710,7 @@
       <w:pPr>
         <w:pStyle w:val="Heading2"/>
       </w:pPr>
-      <w:bookmarkStart w:id="14" w:name="_Toc242347114"/>
+      <w:bookmarkStart w:id="14" w:name="_Toc242349857"/>
       <w:r>
         <w:t>5.2 Artefactos y reproducción</w:t>
       </w:r>
@@ -5741,7 +5741,7 @@
       <w:pPr>
         <w:pStyle w:val="Heading1"/>
       </w:pPr>
-      <w:bookmarkStart w:id="15" w:name="_Toc242347115"/>
+      <w:bookmarkStart w:id="15" w:name="_Toc242349858"/>
       <w:r>
         <w:lastRenderedPageBreak/>
         <w:t>6. Algoritmos y metodología científica</w:t>
@@ -5752,7 +5752,7 @@
       <w:pPr>
         <w:pStyle w:val="Heading2"/>
       </w:pPr>
-      <w:bookmarkStart w:id="16" w:name="_Toc242347116"/>
+      <w:bookmarkStart w:id="16" w:name="_Toc242349859"/>
       <w:r>
         <w:t>6.1 Fuerzas y potencia longitudinal</w:t>
       </w:r>
@@ -6334,39 +6334,46 @@
             <w:rPr>
               <w:rFonts w:ascii="Cambria Math" w:hAnsi="Cambria Math"/>
             </w:rPr>
-            <m:t xml:space="preserve"> · |</m:t>
+            <m:t xml:space="preserve"> · </m:t>
           </m:r>
-          <m:sSub>
-            <m:sSubPr>
+          <m:d>
+            <m:dPr>
+              <m:begChr m:val="|"/>
+              <m:endChr m:val="|"/>
               <m:ctrlPr>
                 <w:rPr>
                   <w:rFonts w:ascii="Cambria Math" w:hAnsi="Cambria Math"/>
                 </w:rPr>
               </m:ctrlPr>
-            </m:sSubPr>
+            </m:dPr>
             <m:e>
-              <m:r>
-                <w:rPr>
-                  <w:rFonts w:ascii="Cambria Math" w:hAnsi="Cambria Math"/>
-                </w:rPr>
-                <m:t>v</m:t>
-              </m:r>
+              <m:sSub>
+                <m:sSubPr>
+                  <m:ctrlPr>
+                    <w:rPr>
+                      <w:rFonts w:ascii="Cambria Math" w:hAnsi="Cambria Math"/>
+                    </w:rPr>
+                  </m:ctrlPr>
+                </m:sSubPr>
+                <m:e>
+                  <m:r>
+                    <w:rPr>
+                      <w:rFonts w:ascii="Cambria Math" w:hAnsi="Cambria Math"/>
+                    </w:rPr>
+                    <m:t>v</m:t>
+                  </m:r>
+                </m:e>
+                <m:sub>
+                  <m:r>
+                    <w:rPr>
+                      <w:rFonts w:ascii="Cambria Math" w:hAnsi="Cambria Math"/>
+                    </w:rPr>
+                    <m:t>rel</m:t>
+                  </m:r>
+                </m:sub>
+              </m:sSub>
             </m:e>
-            <m:sub>
-              <m:r>
-                <w:rPr>
-                  <w:rFonts w:ascii="Cambria Math" w:hAnsi="Cambria Math"/>
-                </w:rPr>
-                <m:t>rel</m:t>
-              </m:r>
-            </m:sub>
-          </m:sSub>
-          <m:r>
-            <w:rPr>
-              <w:rFonts w:ascii="Cambria Math" w:hAnsi="Cambria Math"/>
-            </w:rPr>
-            <m:t>|</m:t>
-          </m:r>
+          </m:d>
         </m:oMath>
       </m:oMathPara>
     </w:p>
@@ -6685,7 +6692,7 @@
       <w:pPr>
         <w:pStyle w:val="Heading2"/>
       </w:pPr>
-      <w:bookmarkStart w:id="17" w:name="_Toc242347117"/>
+      <w:bookmarkStart w:id="17" w:name="_Toc242349860"/>
       <w:r>
         <w:t>6.2 Ciclista, transmisión y motor</w:t>
       </w:r>
@@ -7108,7 +7115,7 @@
       <w:pPr>
         <w:pStyle w:val="Heading2"/>
       </w:pPr>
-      <w:bookmarkStart w:id="18" w:name="_Toc242347118"/>
+      <w:bookmarkStart w:id="18" w:name="_Toc242349861"/>
       <w:r>
         <w:t>6.3 Batería energética y estado de carga</w:t>
       </w:r>
@@ -7494,7 +7501,7 @@
       <w:pPr>
         <w:pStyle w:val="Heading2"/>
       </w:pPr>
-      <w:bookmarkStart w:id="19" w:name="_Toc242347119"/>
+      <w:bookmarkStart w:id="19" w:name="_Toc242349862"/>
       <w:r>
         <w:t>6.4 Circuito equivalente de batería</w:t>
       </w:r>
@@ -7924,7 +7931,7 @@
       <w:pPr>
         <w:pStyle w:val="Heading2"/>
       </w:pPr>
-      <w:bookmarkStart w:id="20" w:name="_Toc242347120"/>
+      <w:bookmarkStart w:id="20" w:name="_Toc242349863"/>
       <w:r>
         <w:t>6.5 Límites, regeneración y balance</w:t>
       </w:r>
@@ -8084,7 +8091,7 @@
       <w:pPr>
         <w:pStyle w:val="Heading2"/>
       </w:pPr>
-      <w:bookmarkStart w:id="21" w:name="_Toc242347121"/>
+      <w:bookmarkStart w:id="21" w:name="_Toc242349864"/>
       <w:r>
         <w:t>6.6 Calibración e identificabilidad</w:t>
       </w:r>
@@ -8317,49 +8324,65 @@
       </w:pPr>
       <m:oMathPara>
         <m:oMath>
-          <m:r>
-            <w:rPr>
-              <w:rFonts w:ascii="Cambria Math" w:hAnsi="Cambria Math"/>
-            </w:rPr>
-            <m:t>θ</m:t>
-          </m:r>
-          <m:r>
-            <w:rPr>
-              <w:rFonts w:ascii="Cambria Math" w:hAnsi="Cambria Math"/>
-            </w:rPr>
-            <m:t>*</m:t>
-          </m:r>
+          <m:sSup>
+            <m:sSupPr>
+              <m:ctrlPr>
+                <w:rPr>
+                  <w:rFonts w:ascii="Cambria Math" w:hAnsi="Cambria Math"/>
+                </w:rPr>
+              </m:ctrlPr>
+            </m:sSupPr>
+            <m:e>
+              <m:r>
+                <w:rPr>
+                  <w:rFonts w:ascii="Cambria Math" w:hAnsi="Cambria Math"/>
+                </w:rPr>
+                <m:t>θ</m:t>
+              </m:r>
+            </m:e>
+            <m:sup>
+              <m:r>
+                <w:rPr>
+                  <w:rFonts w:ascii="Cambria Math" w:hAnsi="Cambria Math"/>
+                </w:rPr>
+                <m:t>*</m:t>
+              </m:r>
+            </m:sup>
+          </m:sSup>
           <m:r>
             <w:rPr>
               <w:rFonts w:ascii="Cambria Math" w:hAnsi="Cambria Math"/>
             </w:rPr>
             <m:t xml:space="preserve"> = </m:t>
           </m:r>
-          <m:sSub>
-            <m:sSubPr>
+          <m:limLow>
+            <m:limLowPr>
               <m:ctrlPr>
                 <w:rPr>
                   <w:rFonts w:ascii="Cambria Math" w:hAnsi="Cambria Math"/>
                 </w:rPr>
               </m:ctrlPr>
-            </m:sSubPr>
+            </m:limLowPr>
             <m:e>
               <m:r>
+                <m:rPr>
+                  <m:sty m:val="p"/>
+                </m:rPr>
                 <w:rPr>
                   <w:rFonts w:ascii="Cambria Math" w:hAnsi="Cambria Math"/>
                 </w:rPr>
                 <m:t>argmin</m:t>
               </m:r>
             </m:e>
-            <m:sub>
+            <m:lim>
               <m:r>
                 <w:rPr>
                   <w:rFonts w:ascii="Cambria Math" w:hAnsi="Cambria Math"/>
                 </w:rPr>
                 <m:t>θ</m:t>
               </m:r>
-            </m:sub>
-          </m:sSub>
+            </m:lim>
+          </m:limLow>
           <m:r>
             <w:rPr>
               <w:rFonts w:ascii="Cambria Math" w:hAnsi="Cambria Math"/>
@@ -8412,7 +8435,7 @@
       <w:pPr>
         <w:pStyle w:val="Heading2"/>
       </w:pPr>
-      <w:bookmarkStart w:id="22" w:name="_Toc242347122"/>
+      <w:bookmarkStart w:id="22" w:name="_Toc242349865"/>
       <w:r>
         <w:t>6.7 Aprendizaje residual y modelos comparados</w:t>
       </w:r>
@@ -8902,7 +8925,7 @@
       <w:pPr>
         <w:pStyle w:val="Heading2"/>
       </w:pPr>
-      <w:bookmarkStart w:id="23" w:name="_Toc242347123"/>
+      <w:bookmarkStart w:id="23" w:name="_Toc242349866"/>
       <w:r>
         <w:lastRenderedPageBreak/>
         <w:t>6.8 Compuerta de confianza y soporte OOD</w:t>
@@ -9099,7 +9122,7 @@
       <w:pPr>
         <w:pStyle w:val="Heading2"/>
       </w:pPr>
-      <w:bookmarkStart w:id="24" w:name="_Toc242347124"/>
+      <w:bookmarkStart w:id="24" w:name="_Toc242349867"/>
       <w:r>
         <w:t>6.9 Adaptación y evaluación causal</w:t>
       </w:r>
@@ -9153,7 +9176,7 @@
       <w:pPr>
         <w:pStyle w:val="Heading2"/>
       </w:pPr>
-      <w:bookmarkStart w:id="25" w:name="_Toc242347125"/>
+      <w:bookmarkStart w:id="25" w:name="_Toc242349868"/>
       <w:r>
         <w:t>6.10 Intervalos y propagación de incertidumbre</w:t>
       </w:r>
@@ -9365,7 +9388,7 @@
       <w:pPr>
         <w:pStyle w:val="Heading2"/>
       </w:pPr>
-      <w:bookmarkStart w:id="26" w:name="_Toc242347126"/>
+      <w:bookmarkStart w:id="26" w:name="_Toc242349869"/>
       <w:r>
         <w:t>6.11 Misión, autonomía y trayectorias</w:t>
       </w:r>
@@ -9451,7 +9474,7 @@
       <w:pPr>
         <w:pStyle w:val="Heading2"/>
       </w:pPr>
-      <w:bookmarkStart w:id="27" w:name="_Toc242347127"/>
+      <w:bookmarkStart w:id="27" w:name="_Toc242349870"/>
       <w:r>
         <w:t>6.12 Sensibilidad local y global</w:t>
       </w:r>
@@ -9892,7 +9915,7 @@
       <w:pPr>
         <w:pStyle w:val="Heading1"/>
       </w:pPr>
-      <w:bookmarkStart w:id="28" w:name="_Toc242347128"/>
+      <w:bookmarkStart w:id="28" w:name="_Toc242349871"/>
       <w:r>
         <w:t>7. Restricciones y límites</w:t>
       </w:r>
@@ -9902,7 +9925,7 @@
       <w:pPr>
         <w:pStyle w:val="Heading2"/>
       </w:pPr>
-      <w:bookmarkStart w:id="29" w:name="_Toc242347129"/>
+      <w:bookmarkStart w:id="29" w:name="_Toc242349872"/>
       <w:r>
         <w:t>7.1 Identidad de la entrega y límites</w:t>
       </w:r>
@@ -9943,7 +9966,7 @@
       <w:pPr>
         <w:pStyle w:val="Heading2"/>
       </w:pPr>
-      <w:bookmarkStart w:id="30" w:name="_Toc242347130"/>
+      <w:bookmarkStart w:id="30" w:name="_Toc242349873"/>
       <w:r>
         <w:t>7.2 Protocolos y resultados sintéticos</w:t>
       </w:r>
@@ -10818,7 +10841,7 @@
       <w:pPr>
         <w:pStyle w:val="Heading2"/>
       </w:pPr>
-      <w:bookmarkStart w:id="31" w:name="_Toc242347131"/>
+      <w:bookmarkStart w:id="31" w:name="_Toc242349874"/>
       <w:r>
         <w:t>7.3 Reproducción y límites de la evidencia</w:t>
       </w:r>
@@ -10874,7 +10897,7 @@
       <w:pPr>
         <w:pStyle w:val="Heading1"/>
       </w:pPr>
-      <w:bookmarkStart w:id="32" w:name="_Toc242347132"/>
+      <w:bookmarkStart w:id="32" w:name="_Toc242349875"/>
       <w:r>
         <w:lastRenderedPageBreak/>
         <w:t>8. Despliegue y ejecución</w:t>
@@ -10885,7 +10908,7 @@
       <w:pPr>
         <w:pStyle w:val="Heading2"/>
       </w:pPr>
-      <w:bookmarkStart w:id="33" w:name="_Toc242347133"/>
+      <w:bookmarkStart w:id="33" w:name="_Toc242349876"/>
       <w:r>
         <w:t>8.1 Pruebas y distribución Windows</w:t>
       </w:r>
@@ -10961,7 +10984,7 @@
       <w:pPr>
         <w:pStyle w:val="Heading1"/>
       </w:pPr>
-      <w:bookmarkStart w:id="34" w:name="_Toc242347134"/>
+      <w:bookmarkStart w:id="34" w:name="_Toc242349877"/>
       <w:r>
         <w:lastRenderedPageBreak/>
         <w:t>9. Glosario y referencias académicas</w:t>
@@ -10972,7 +10995,7 @@
       <w:pPr>
         <w:pStyle w:val="Heading2"/>
       </w:pPr>
-      <w:bookmarkStart w:id="35" w:name="_Toc242347135"/>
+      <w:bookmarkStart w:id="35" w:name="_Toc242349878"/>
       <w:r>
         <w:t>9.1 Glosario de términos</w:t>
       </w:r>
@@ -11742,7 +11765,7 @@
       <w:pPr>
         <w:pStyle w:val="Heading2"/>
       </w:pPr>
-      <w:bookmarkStart w:id="36" w:name="_Toc242347136"/>
+      <w:bookmarkStart w:id="36" w:name="_Toc242349879"/>
       <w:r>
         <w:t>9.2 Referencias académicas</w:t>
       </w:r>
@@ -11929,7 +11952,7 @@
       <w:pPr>
         <w:pStyle w:val="Heading2"/>
       </w:pPr>
-      <w:bookmarkStart w:id="37" w:name="_Toc242347137"/>
+      <w:bookmarkStart w:id="37" w:name="_Toc242349880"/>
       <w:r>
         <w:t>Autoría y condiciones de uso</w:t>
       </w:r>

</xml_diff>